<commit_message>
Atualiza Aulas 1-2 com novos conteudos e restringe repo as Aulas 1-2
Aula 1: slides de correcao coletiva ampliada apos a atividade pratica.
Aula 2: novas secoes de ambiguidade/conflitos de requisitos e priorizacao
MoSCoW na apostila e nos slides, com material de reserva.

Remove do rastreamento as Aulas 3-21 (arquivos continuam no disco) para
adicionar aula a aula conforme forem finalizadas. Restaura o README.md.
</commit_message>
<xml_diff>
--- a/Aula 02 - 04-09-2026/Aula 2 - Apostila do Aluno.docx
+++ b/Aula 02 - 04-09-2026/Aula 2 - Apostila do Aluno.docx
@@ -1006,7 +1006,13 @@
         <w:pStyle w:val="Heading1"/>
       </w:pPr>
       <w:r>
-        <w:t>4. Técnicas de análise de requisitos</w:t>
+        <w:t>4. Ambiguidade e Conflitos entre Requisitos</w:t>
+      </w:r>
+    </w:p>
+    <w:p>
+      <w:pPr/>
+      <w:r>
+        <w:t>Mesmo seguindo o padrão “o sistema deve...”, um requisito ainda pode estar mal escrito. Dois problemas aparecem com frequência: ambiguidade e conflito entre requisitos.</w:t>
       </w:r>
     </w:p>
     <w:p>
@@ -1014,7 +1020,208 @@
         <w:pStyle w:val="Heading2"/>
       </w:pPr>
       <w:r>
-        <w:t>4.1 Entrevista</w:t>
+        <w:t>4.1 Requisitos ambíguos</w:t>
+      </w:r>
+    </w:p>
+    <w:p>
+      <w:pPr/>
+      <w:r>
+        <w:t>Um requisito é ambíguo quando admite mais de uma interpretação. As causas mais comuns são adjetivos vagos (“rápido”, “bom”, “fácil”), pronomes sem referência clara e o uso de “e/ou” sem definir prioridade.</w:t>
+      </w:r>
+    </w:p>
+    <w:p>
+      <w:pPr/>
+      <w:r>
+        <w:t>Exemplo: “O sistema deve tratar bem os pedidos urgentes.” — Qual ação, exatamente? O que torna um pedido “urgente”? Sem responder isso, ninguém sabe testar o requisito.</w:t>
+      </w:r>
+    </w:p>
+    <w:p>
+      <w:pPr>
+        <w:pStyle w:val="Heading2"/>
+      </w:pPr>
+      <w:r>
+        <w:t>4.2 Conflitos entre requisitos</w:t>
+      </w:r>
+    </w:p>
+    <w:p>
+      <w:pPr/>
+      <w:r>
+        <w:t>Dois requisitos podem estar, cada um, bem escritos e ainda assim conflitarem entre si — atender totalmente um pode dificultar o outro.</w:t>
+      </w:r>
+    </w:p>
+    <w:p>
+      <w:pPr/>
+      <w:r>
+        <w:t>Exemplo TechBurger: a regra “pedidos com mais de 10 itens exigem confirmação manual de um gerente” (controle/qualidade) pode entrar em tensão com um requisito futuro de desempenho como “todo pedido deve ser confirmado em até 1 minuto” — a confirmação manual pode não caber nesse tempo.</w:t>
+      </w:r>
+    </w:p>
+    <w:p>
+      <w:pPr/>
+      <w:r>
+        <w:t>Como resolver: não ignorar o conflito — negociar a prioridade com o dono do negócio e documentar a decisão tomada, para que a equipe de desenvolvimento saiba qual requisito prevalece.</w:t>
+      </w:r>
+    </w:p>
+    <w:p>
+      <w:pPr>
+        <w:pStyle w:val="Heading2"/>
+      </w:pPr>
+      <w:r>
+        <w:t>4.3 Pratique: ache o problema</w:t>
+      </w:r>
+    </w:p>
+    <w:p>
+      <w:pPr/>
+      <w:r>
+        <w:t>Para cada requisito abaixo, identifiquem se o problema é ambiguidade, conflito, ou os dois — e proponham uma versão corrigida.</w:t>
+      </w:r>
+    </w:p>
+    <w:tbl>
+      <w:tblPr>
+        <w:tblStyle w:val="TableGrid"/>
+        <w:tblW w:type="auto" w:w="0"/>
+        <w:tblLook w:firstColumn="1" w:firstRow="1" w:lastColumn="0" w:lastRow="0" w:noHBand="0" w:noVBand="1" w:val="04A0"/>
+      </w:tblPr>
+      <w:tblGrid>
+        <w:gridCol w:w="3324"/>
+        <w:gridCol w:w="3324"/>
+        <w:gridCol w:w="3324"/>
+      </w:tblGrid>
+      <w:tr>
+        <w:tc>
+          <w:tcPr>
+            <w:tcW w:type="dxa" w:w="3324"/>
+          </w:tcPr>
+          <w:p>
+            <w:r>
+              <w:t>Requisito</w:t>
+            </w:r>
+          </w:p>
+        </w:tc>
+        <w:tc>
+          <w:tcPr>
+            <w:tcW w:type="dxa" w:w="3324"/>
+          </w:tcPr>
+          <w:p>
+            <w:r>
+              <w:t>Problema</w:t>
+            </w:r>
+          </w:p>
+        </w:tc>
+        <w:tc>
+          <w:tcPr>
+            <w:tcW w:type="dxa" w:w="3324"/>
+          </w:tcPr>
+          <w:p>
+            <w:r>
+              <w:t>Versão corrigida</w:t>
+            </w:r>
+          </w:p>
+        </w:tc>
+      </w:tr>
+      <w:tr>
+        <w:tc>
+          <w:tcPr>
+            <w:tcW w:type="dxa" w:w="3324"/>
+          </w:tcPr>
+          <w:p>
+            <w:r>
+              <w:t>“O sistema deve processar pedidos rapidamente.”</w:t>
+            </w:r>
+          </w:p>
+        </w:tc>
+        <w:tc>
+          <w:tcPr>
+            <w:tcW w:type="dxa" w:w="3324"/>
+          </w:tcPr>
+          <w:p>
+            <w:r/>
+          </w:p>
+        </w:tc>
+        <w:tc>
+          <w:tcPr>
+            <w:tcW w:type="dxa" w:w="3324"/>
+          </w:tcPr>
+          <w:p>
+            <w:r/>
+          </w:p>
+        </w:tc>
+      </w:tr>
+      <w:tr>
+        <w:tc>
+          <w:tcPr>
+            <w:tcW w:type="dxa" w:w="3324"/>
+          </w:tcPr>
+          <w:p>
+            <w:r>
+              <w:t>“O aplicativo deve ser fácil de usar e seguro ao mesmo tempo, sem exigir login.”</w:t>
+            </w:r>
+          </w:p>
+        </w:tc>
+        <w:tc>
+          <w:tcPr>
+            <w:tcW w:type="dxa" w:w="3324"/>
+          </w:tcPr>
+          <w:p>
+            <w:r/>
+          </w:p>
+        </w:tc>
+        <w:tc>
+          <w:tcPr>
+            <w:tcW w:type="dxa" w:w="3324"/>
+          </w:tcPr>
+          <w:p>
+            <w:r/>
+          </w:p>
+        </w:tc>
+      </w:tr>
+      <w:tr>
+        <w:tc>
+          <w:tcPr>
+            <w:tcW w:type="dxa" w:w="3324"/>
+          </w:tcPr>
+          <w:p>
+            <w:r>
+              <w:t>“Todo pedido deve ser entregue em até 20 minutos.” (considerando a regra de confirmação manual do gerente para pedidos grandes)</w:t>
+            </w:r>
+          </w:p>
+        </w:tc>
+        <w:tc>
+          <w:tcPr>
+            <w:tcW w:type="dxa" w:w="3324"/>
+          </w:tcPr>
+          <w:p>
+            <w:r/>
+          </w:p>
+        </w:tc>
+        <w:tc>
+          <w:tcPr>
+            <w:tcW w:type="dxa" w:w="3324"/>
+          </w:tcPr>
+          <w:p>
+            <w:r/>
+          </w:p>
+        </w:tc>
+      </w:tr>
+    </w:tbl>
+    <w:p>
+      <w:pPr/>
+    </w:p>
+    <w:p>
+      <w:pPr>
+        <w:pStyle w:val="Heading1"/>
+      </w:pPr>
+      <w:r/>
+      <w:r>
+        <w:t>5. Técnicas de análise de requisitos</w:t>
+      </w:r>
+    </w:p>
+    <w:p>
+      <w:pPr>
+        <w:pStyle w:val="Heading2"/>
+      </w:pPr>
+      <w:r/>
+      <w:r>
+        <w:t>5.1 Entrevista</w:t>
       </w:r>
     </w:p>
     <w:p>
@@ -1037,8 +1244,9 @@
       <w:pPr>
         <w:pStyle w:val="Heading2"/>
       </w:pPr>
+      <w:r/>
       <w:r>
-        <w:t>4.2 Questionário</w:t>
+        <w:t>5.2 Questionário</w:t>
       </w:r>
     </w:p>
     <w:p>
@@ -1061,8 +1269,9 @@
       <w:pPr>
         <w:pStyle w:val="Heading2"/>
       </w:pPr>
+      <w:r/>
       <w:r>
-        <w:t>4.3 Observação</w:t>
+        <w:t>5.3 Observação</w:t>
       </w:r>
     </w:p>
     <w:p>
@@ -1085,8 +1294,9 @@
       <w:pPr>
         <w:pStyle w:val="Heading2"/>
       </w:pPr>
+      <w:r/>
       <w:r>
-        <w:t>4.4 Brainstorming</w:t>
+        <w:t>5.4 Brainstorming</w:t>
       </w:r>
     </w:p>
     <w:p>
@@ -1109,8 +1319,9 @@
       <w:pPr>
         <w:pStyle w:val="Heading2"/>
       </w:pPr>
+      <w:r/>
       <w:r>
-        <w:t>4.5 Prototipação</w:t>
+        <w:t>5.5 Prototipação</w:t>
       </w:r>
     </w:p>
     <w:p>
@@ -1133,8 +1344,9 @@
       <w:pPr>
         <w:pStyle w:val="Heading2"/>
       </w:pPr>
+      <w:r/>
       <w:r>
-        <w:t>4.6 Análise de documentos</w:t>
+        <w:t>5.6 Análise de documentos</w:t>
       </w:r>
     </w:p>
     <w:p>
@@ -1147,8 +1359,9 @@
       <w:pPr>
         <w:pStyle w:val="Heading2"/>
       </w:pPr>
+      <w:r/>
       <w:r>
-        <w:t>4.7 Workshop de requisitos (JAD)</w:t>
+        <w:t>5.7 Workshop de requisitos (JAD)</w:t>
       </w:r>
     </w:p>
     <w:p>
@@ -1161,8 +1374,9 @@
       <w:pPr>
         <w:pStyle w:val="Heading2"/>
       </w:pPr>
+      <w:r/>
       <w:r>
-        <w:t>4.8 Qual técnica usar em cada situação?</w:t>
+        <w:t>5.8 Qual técnica usar em cada situação?</w:t>
       </w:r>
     </w:p>
     <w:tbl>
@@ -1386,7 +1600,45 @@
         <w:pStyle w:val="Heading1"/>
       </w:pPr>
       <w:r>
-        <w:t>5. Atividade prática</w:t>
+        <w:t>6. Priorização de Requisitos (MoSCoW)</w:t>
+      </w:r>
+    </w:p>
+    <w:p>
+      <w:pPr/>
+      <w:r>
+        <w:t>Depois de levantar e escrever bons requisitos, ainda falta decidir o que entra primeiro no sistema — principalmente quando o tempo ou o orçamento são limitados. O método MoSCoW ajuda nessa priorização, classificando cada requisito em uma de quatro categorias:</w:t>
+      </w:r>
+    </w:p>
+    <w:p>
+      <w:pPr>
+        <w:pStyle w:val="ListBullet"/>
+      </w:pPr>
+      <w:r>
+        <w:t>Must have — essencial; sem ele o sistema não cumpre seu propósito.</w:t>
+      </w:r>
+    </w:p>
+    <w:p>
+      <w:pPr>
+        <w:pStyle w:val="ListBullet"/>
+      </w:pPr>
+      <w:r>
+        <w:t>Should have — importante, mas o sistema ainda funciona sem ele no lançamento.</w:t>
+      </w:r>
+    </w:p>
+    <w:p>
+      <w:pPr>
+        <w:pStyle w:val="ListBullet"/>
+      </w:pPr>
+      <w:r>
+        <w:t>Could have — desejável, entra apenas se sobrar tempo ou recurso.</w:t>
+      </w:r>
+    </w:p>
+    <w:p>
+      <w:pPr>
+        <w:pStyle w:val="ListBullet"/>
+      </w:pPr>
+      <w:r>
+        <w:t>Won't have (por agora) — fica fora do escopo atual, sem descartar para o futuro.</w:t>
       </w:r>
     </w:p>
     <w:p>
@@ -1394,7 +1646,214 @@
         <w:pStyle w:val="Heading2"/>
       </w:pPr>
       <w:r>
-        <w:t>5.1 Role-play de entrevista</w:t>
+        <w:t>6.1 Exemplo aplicado ao TechBurger</w:t>
+      </w:r>
+    </w:p>
+    <w:tbl>
+      <w:tblPr>
+        <w:tblStyle w:val="TableGrid"/>
+        <w:tblW w:type="auto" w:w="0"/>
+        <w:tblLook w:firstColumn="1" w:firstRow="1" w:lastColumn="0" w:lastRow="0" w:noHBand="0" w:noVBand="1" w:val="04A0"/>
+      </w:tblPr>
+      <w:tblGrid>
+        <w:gridCol w:w="3324"/>
+        <w:gridCol w:w="3324"/>
+        <w:gridCol w:w="3324"/>
+      </w:tblGrid>
+      <w:tr>
+        <w:tc>
+          <w:tcPr>
+            <w:tcW w:type="dxa" w:w="3324"/>
+          </w:tcPr>
+          <w:p>
+            <w:r>
+              <w:t>Categoria</w:t>
+            </w:r>
+          </w:p>
+        </w:tc>
+        <w:tc>
+          <w:tcPr>
+            <w:tcW w:type="dxa" w:w="3324"/>
+          </w:tcPr>
+          <w:p>
+            <w:r>
+              <w:t>Requisito</w:t>
+            </w:r>
+          </w:p>
+        </w:tc>
+        <w:tc>
+          <w:tcPr>
+            <w:tcW w:type="dxa" w:w="3324"/>
+          </w:tcPr>
+          <w:p>
+            <w:r>
+              <w:t>Por quê</w:t>
+            </w:r>
+          </w:p>
+        </w:tc>
+      </w:tr>
+      <w:tr>
+        <w:tc>
+          <w:tcPr>
+            <w:tcW w:type="dxa" w:w="3324"/>
+          </w:tcPr>
+          <w:p>
+            <w:r>
+              <w:t>Must</w:t>
+            </w:r>
+          </w:p>
+        </w:tc>
+        <w:tc>
+          <w:tcPr>
+            <w:tcW w:type="dxa" w:w="3324"/>
+          </w:tcPr>
+          <w:p>
+            <w:r>
+              <w:t>“O sistema deve enviar o pedido para a cozinha somente após a confirmação do pagamento.”</w:t>
+            </w:r>
+          </w:p>
+        </w:tc>
+        <w:tc>
+          <w:tcPr>
+            <w:tcW w:type="dxa" w:w="3324"/>
+          </w:tcPr>
+          <w:p>
+            <w:r>
+              <w:t>Sem isso, a operação financeira e a cozinha ficam desalinhadas.</w:t>
+            </w:r>
+          </w:p>
+        </w:tc>
+      </w:tr>
+      <w:tr>
+        <w:tc>
+          <w:tcPr>
+            <w:tcW w:type="dxa" w:w="3324"/>
+          </w:tcPr>
+          <w:p>
+            <w:r>
+              <w:t>Should</w:t>
+            </w:r>
+          </w:p>
+        </w:tc>
+        <w:tc>
+          <w:tcPr>
+            <w:tcW w:type="dxa" w:w="3324"/>
+          </w:tcPr>
+          <w:p>
+            <w:r>
+              <w:t>“O sistema deve aplicar 5% de desconto automático quando o pagamento for via PIX.”</w:t>
+            </w:r>
+          </w:p>
+        </w:tc>
+        <w:tc>
+          <w:tcPr>
+            <w:tcW w:type="dxa" w:w="3324"/>
+          </w:tcPr>
+          <w:p>
+            <w:r>
+              <w:t>Importante comercialmente, mas o sistema roda sem isso.</w:t>
+            </w:r>
+          </w:p>
+        </w:tc>
+      </w:tr>
+      <w:tr>
+        <w:tc>
+          <w:tcPr>
+            <w:tcW w:type="dxa" w:w="3324"/>
+          </w:tcPr>
+          <w:p>
+            <w:r>
+              <w:t>Could</w:t>
+            </w:r>
+          </w:p>
+        </w:tc>
+        <w:tc>
+          <w:tcPr>
+            <w:tcW w:type="dxa" w:w="3324"/>
+          </w:tcPr>
+          <w:p>
+            <w:r>
+              <w:t>“O aplicativo deve sugerir um item substituto quando o item selecionado estiver em falta.”</w:t>
+            </w:r>
+          </w:p>
+        </w:tc>
+        <w:tc>
+          <w:tcPr>
+            <w:tcW w:type="dxa" w:w="3324"/>
+          </w:tcPr>
+          <w:p>
+            <w:r>
+              <w:t>Melhora a experiência, não é crítico para concluir o pedido.</w:t>
+            </w:r>
+          </w:p>
+        </w:tc>
+      </w:tr>
+      <w:tr>
+        <w:tc>
+          <w:tcPr>
+            <w:tcW w:type="dxa" w:w="3324"/>
+          </w:tcPr>
+          <w:p>
+            <w:r>
+              <w:t>Won't (por agora)</w:t>
+            </w:r>
+          </w:p>
+        </w:tc>
+        <w:tc>
+          <w:tcPr>
+            <w:tcW w:type="dxa" w:w="3324"/>
+          </w:tcPr>
+          <w:p>
+            <w:r>
+              <w:t>“O sistema deve recomendar produtos usando inteligência artificial.”</w:t>
+            </w:r>
+          </w:p>
+        </w:tc>
+        <w:tc>
+          <w:tcPr>
+            <w:tcW w:type="dxa" w:w="3324"/>
+          </w:tcPr>
+          <w:p>
+            <w:r>
+              <w:t>Fora do escopo desta primeira versão do sistema.</w:t>
+            </w:r>
+          </w:p>
+        </w:tc>
+      </w:tr>
+    </w:tbl>
+    <w:p>
+      <w:pPr>
+        <w:pStyle w:val="Heading2"/>
+      </w:pPr>
+      <w:r>
+        <w:t>6.2 Por que priorizar importa</w:t>
+      </w:r>
+    </w:p>
+    <w:p>
+      <w:pPr/>
+      <w:r>
+        <w:t>Priorizar ajuda o time e o cliente a alinharem expectativas sobre o que estará pronto na primeira entrega, e evita que funcionalidades “seria legal ter” atrasem o que é essencial para o negócio funcionar.</w:t>
+      </w:r>
+    </w:p>
+    <w:p>
+      <w:pPr/>
+    </w:p>
+    <w:p>
+      <w:pPr>
+        <w:pStyle w:val="Heading1"/>
+      </w:pPr>
+      <w:r/>
+      <w:r>
+        <w:t>7. Atividade prática</w:t>
+      </w:r>
+    </w:p>
+    <w:p>
+      <w:pPr>
+        <w:pStyle w:val="Heading2"/>
+      </w:pPr>
+      <w:r/>
+      <w:r>
+        <w:t>7.1 Role-play de entrevista</w:t>
       </w:r>
     </w:p>
     <w:p>
@@ -1425,8 +1884,9 @@
       <w:pPr>
         <w:pStyle w:val="Heading2"/>
       </w:pPr>
+      <w:r/>
       <w:r>
-        <w:t>5.2 Das regras aos requisitos</w:t>
+        <w:t>7.2 Das regras aos requisitos</w:t>
       </w:r>
     </w:p>
     <w:p>
@@ -1842,6 +2302,396 @@
     <w:p/>
     <w:p>
       <w:pPr>
+        <w:pStyle w:val="Heading2"/>
+      </w:pPr>
+      <w:r>
+        <w:t>7.3 Priorização MoSCoW dos requisitos</w:t>
+      </w:r>
+    </w:p>
+    <w:p>
+      <w:pPr/>
+      <w:r>
+        <w:t>Peguem os Requisitos Funcionais que o grupo escreveu na atividade 7.2 e classifiquem cada um em Must, Should, Could ou Won't have (seção 6), justificando pelo menos 2 escolhas.</w:t>
+      </w:r>
+    </w:p>
+    <w:tbl>
+      <w:tblPr>
+        <w:tblStyle w:val="TableGrid"/>
+        <w:tblW w:type="auto" w:w="0"/>
+        <w:tblLook w:firstColumn="1" w:firstRow="1" w:lastColumn="0" w:lastRow="0" w:noHBand="0" w:noVBand="1" w:val="04A0"/>
+      </w:tblPr>
+      <w:tblGrid>
+        <w:gridCol w:w="3324"/>
+        <w:gridCol w:w="3324"/>
+        <w:gridCol w:w="3324"/>
+      </w:tblGrid>
+      <w:tr>
+        <w:tc>
+          <w:tcPr>
+            <w:tcW w:type="dxa" w:w="3324"/>
+          </w:tcPr>
+          <w:p>
+            <w:r>
+              <w:t>Requisito (resumo)</w:t>
+            </w:r>
+          </w:p>
+        </w:tc>
+        <w:tc>
+          <w:tcPr>
+            <w:tcW w:type="dxa" w:w="3324"/>
+          </w:tcPr>
+          <w:p>
+            <w:r>
+              <w:t>Categoria MoSCoW</w:t>
+            </w:r>
+          </w:p>
+        </w:tc>
+        <w:tc>
+          <w:tcPr>
+            <w:tcW w:type="dxa" w:w="3324"/>
+          </w:tcPr>
+          <w:p>
+            <w:r>
+              <w:t>Justificativa</w:t>
+            </w:r>
+          </w:p>
+        </w:tc>
+      </w:tr>
+      <w:tr>
+        <w:tc>
+          <w:tcPr>
+            <w:tcW w:type="dxa" w:w="3324"/>
+          </w:tcPr>
+          <w:p>
+            <w:r/>
+          </w:p>
+        </w:tc>
+        <w:tc>
+          <w:tcPr>
+            <w:tcW w:type="dxa" w:w="3324"/>
+          </w:tcPr>
+          <w:p>
+            <w:r/>
+          </w:p>
+        </w:tc>
+        <w:tc>
+          <w:tcPr>
+            <w:tcW w:type="dxa" w:w="3324"/>
+          </w:tcPr>
+          <w:p>
+            <w:r/>
+          </w:p>
+        </w:tc>
+      </w:tr>
+      <w:tr>
+        <w:tc>
+          <w:tcPr>
+            <w:tcW w:type="dxa" w:w="3324"/>
+          </w:tcPr>
+          <w:p>
+            <w:r/>
+          </w:p>
+        </w:tc>
+        <w:tc>
+          <w:tcPr>
+            <w:tcW w:type="dxa" w:w="3324"/>
+          </w:tcPr>
+          <w:p>
+            <w:r/>
+          </w:p>
+        </w:tc>
+        <w:tc>
+          <w:tcPr>
+            <w:tcW w:type="dxa" w:w="3324"/>
+          </w:tcPr>
+          <w:p>
+            <w:r/>
+          </w:p>
+        </w:tc>
+      </w:tr>
+      <w:tr>
+        <w:tc>
+          <w:tcPr>
+            <w:tcW w:type="dxa" w:w="3324"/>
+          </w:tcPr>
+          <w:p>
+            <w:r/>
+          </w:p>
+        </w:tc>
+        <w:tc>
+          <w:tcPr>
+            <w:tcW w:type="dxa" w:w="3324"/>
+          </w:tcPr>
+          <w:p>
+            <w:r/>
+          </w:p>
+        </w:tc>
+        <w:tc>
+          <w:tcPr>
+            <w:tcW w:type="dxa" w:w="3324"/>
+          </w:tcPr>
+          <w:p>
+            <w:r/>
+          </w:p>
+        </w:tc>
+      </w:tr>
+      <w:tr>
+        <w:tc>
+          <w:tcPr>
+            <w:tcW w:type="dxa" w:w="3324"/>
+          </w:tcPr>
+          <w:p>
+            <w:r/>
+          </w:p>
+        </w:tc>
+        <w:tc>
+          <w:tcPr>
+            <w:tcW w:type="dxa" w:w="3324"/>
+          </w:tcPr>
+          <w:p>
+            <w:r/>
+          </w:p>
+        </w:tc>
+        <w:tc>
+          <w:tcPr>
+            <w:tcW w:type="dxa" w:w="3324"/>
+          </w:tcPr>
+          <w:p>
+            <w:r/>
+          </w:p>
+        </w:tc>
+      </w:tr>
+    </w:tbl>
+    <w:p>
+      <w:pPr/>
+    </w:p>
+    <w:p>
+      <w:pPr>
+        <w:pStyle w:val="Heading1"/>
+      </w:pPr>
+      <w:r>
+        <w:t>8. Critérios de Aceite (material de aprofundamento)</w:t>
+      </w:r>
+    </w:p>
+    <w:p>
+      <w:pPr/>
+      <w:r>
+        <w:t>Um critério de aceite é uma condição objetiva que diz quando um Requisito Funcional pode ser considerado “pronto e correto”. Ele fecha o ciclo regra de negócio → requisito → critério de aceite → teste, que será retomado nas aulas de teste de sistemas mais adiante no curso.</w:t>
+      </w:r>
+    </w:p>
+    <w:p>
+      <w:pPr>
+        <w:pStyle w:val="Heading2"/>
+      </w:pPr>
+      <w:r>
+        <w:t>8.1 Formato simples: Dado / Quando / Então</w:t>
+      </w:r>
+    </w:p>
+    <w:p>
+      <w:pPr/>
+      <w:r>
+        <w:t>Dado [um contexto inicial], Quando [uma ação acontece], Então [o sistema deve reagir assim].</w:t>
+      </w:r>
+    </w:p>
+    <w:p>
+      <w:pPr/>
+      <w:r>
+        <w:t>Exemplo, para o RF “o sistema deve bloquear o envio do pedido para a cozinha até que o pagamento seja confirmado”:</w:t>
+      </w:r>
+    </w:p>
+    <w:p>
+      <w:pPr>
+        <w:pStyle w:val="ListBullet"/>
+      </w:pPr>
+      <w:r>
+        <w:t>Dado um pedido com pagamento pendente, Quando o atendente tentar enviar o pedido à cozinha, Então o sistema deve impedir o envio e exibir uma mensagem de pagamento pendente.</w:t>
+      </w:r>
+    </w:p>
+    <w:p>
+      <w:pPr>
+        <w:pStyle w:val="Heading2"/>
+      </w:pPr>
+      <w:r>
+        <w:t>8.2 Pratique</w:t>
+      </w:r>
+    </w:p>
+    <w:p>
+      <w:pPr/>
+      <w:r>
+        <w:t>Escolham mais 1 RF da tabela da atividade 7.2 e escrevam o critério de aceite dele, no formato Dado/Quando/Então.</w:t>
+      </w:r>
+    </w:p>
+    <w:p>
+      <w:pPr/>
+    </w:p>
+    <w:p>
+      <w:pPr>
+        <w:pStyle w:val="Heading1"/>
+      </w:pPr>
+      <w:r>
+        <w:t>9. Material extra: aplicando tudo à Biblioteca “Ler Mais” (se sobrar tempo)</w:t>
+      </w:r>
+    </w:p>
+    <w:p>
+      <w:pPr/>
+      <w:r>
+        <w:t>Lembram do exemplo da Biblioteca “Ler Mais”, da Aula 1? Vamos aplicar o mesmo processo de hoje — RF, RNF, ambiguidade/conflito e MoSCoW — a esse outro cenário, para treinar o olho em um domínio diferente do TechBurger.</w:t>
+      </w:r>
+    </w:p>
+    <w:p>
+      <w:pPr/>
+      <w:r>
+        <w:t>Regra: associado com 3 livros emprestados não pode pegar um 4º; professor tem prazo de 30 dias em vez de 14; devolução atrasada gera multa de R$ 1,00/dia, exceto livro de leitura escolar.</w:t>
+      </w:r>
+    </w:p>
+    <w:tbl>
+      <w:tblPr>
+        <w:tblStyle w:val="TableGrid"/>
+        <w:tblW w:type="auto" w:w="0"/>
+        <w:tblLook w:firstColumn="1" w:firstRow="1" w:lastColumn="0" w:lastRow="0" w:noHBand="0" w:noVBand="1" w:val="04A0"/>
+      </w:tblPr>
+      <w:tblGrid>
+        <w:gridCol w:w="4986"/>
+        <w:gridCol w:w="4986"/>
+      </w:tblGrid>
+      <w:tr>
+        <w:tc>
+          <w:tcPr>
+            <w:tcW w:type="dxa" w:w="4986"/>
+          </w:tcPr>
+          <w:p>
+            <w:r>
+              <w:t>Artefato</w:t>
+            </w:r>
+          </w:p>
+        </w:tc>
+        <w:tc>
+          <w:tcPr>
+            <w:tcW w:type="dxa" w:w="4986"/>
+          </w:tcPr>
+          <w:p>
+            <w:r>
+              <w:t>Exemplo resolvido</w:t>
+            </w:r>
+          </w:p>
+        </w:tc>
+      </w:tr>
+      <w:tr>
+        <w:tc>
+          <w:tcPr>
+            <w:tcW w:type="dxa" w:w="4986"/>
+          </w:tcPr>
+          <w:p>
+            <w:r>
+              <w:t>RF</w:t>
+            </w:r>
+          </w:p>
+        </w:tc>
+        <w:tc>
+          <w:tcPr>
+            <w:tcW w:type="dxa" w:w="4986"/>
+          </w:tcPr>
+          <w:p>
+            <w:r>
+              <w:t>O sistema deve recusar um novo empréstimo quando o associado já tiver 3 livros emprestados ao mesmo tempo.</w:t>
+            </w:r>
+          </w:p>
+        </w:tc>
+      </w:tr>
+      <w:tr>
+        <w:tc>
+          <w:tcPr>
+            <w:tcW w:type="dxa" w:w="4986"/>
+          </w:tcPr>
+          <w:p>
+            <w:r>
+              <w:t>RF</w:t>
+            </w:r>
+          </w:p>
+        </w:tc>
+        <w:tc>
+          <w:tcPr>
+            <w:tcW w:type="dxa" w:w="4986"/>
+          </w:tcPr>
+          <w:p>
+            <w:r>
+              <w:t>O sistema deve aplicar automaticamente o prazo de 30 dias quando o associado tiver o perfil “professor”.</w:t>
+            </w:r>
+          </w:p>
+        </w:tc>
+      </w:tr>
+      <w:tr>
+        <w:tc>
+          <w:tcPr>
+            <w:tcW w:type="dxa" w:w="4986"/>
+          </w:tcPr>
+          <w:p>
+            <w:r>
+              <w:t>RNF (Usabilidade)</w:t>
+            </w:r>
+          </w:p>
+        </w:tc>
+        <w:tc>
+          <w:tcPr>
+            <w:tcW w:type="dxa" w:w="4986"/>
+          </w:tcPr>
+          <w:p>
+            <w:r>
+              <w:t>O atendente deve conseguir registrar um novo empréstimo em no máximo 3 telas.</w:t>
+            </w:r>
+          </w:p>
+        </w:tc>
+      </w:tr>
+      <w:tr>
+        <w:tc>
+          <w:tcPr>
+            <w:tcW w:type="dxa" w:w="4986"/>
+          </w:tcPr>
+          <w:p>
+            <w:r>
+              <w:t>Ambíguo? corrija</w:t>
+            </w:r>
+          </w:p>
+        </w:tc>
+        <w:tc>
+          <w:tcPr>
+            <w:tcW w:type="dxa" w:w="4986"/>
+          </w:tcPr>
+          <w:p>
+            <w:r>
+              <w:t>“O sistema deve avisar o associado rapidamente sobre a multa.” → “O sistema deve notificar o associado por e-mail em até 1 hora após a devolução em atraso.”</w:t>
+            </w:r>
+          </w:p>
+        </w:tc>
+      </w:tr>
+      <w:tr>
+        <w:tc>
+          <w:tcPr>
+            <w:tcW w:type="dxa" w:w="4986"/>
+          </w:tcPr>
+          <w:p>
+            <w:r>
+              <w:t>MoSCoW</w:t>
+            </w:r>
+          </w:p>
+        </w:tc>
+        <w:tc>
+          <w:tcPr>
+            <w:tcW w:type="dxa" w:w="4986"/>
+          </w:tcPr>
+          <w:p>
+            <w:r>
+              <w:t>Recusar o 4º empréstimo = Must (regra central do negócio); notificar por e-mail = Should (importante, mas o sistema funciona sem isso no dia 1).</w:t>
+            </w:r>
+          </w:p>
+        </w:tc>
+      </w:tr>
+    </w:tbl>
+    <w:p>
+      <w:pPr/>
+    </w:p>
+    <w:p>
+      <w:pPr>
         <w:pStyle w:val="Heading1"/>
       </w:pPr>
       <w:r>
@@ -2099,6 +2949,94 @@
           </w:p>
         </w:tc>
       </w:tr>
+      <w:tr>
+        <w:tc>
+          <w:tcPr>
+            <w:tcW w:type="dxa" w:w="4986"/>
+          </w:tcPr>
+          <w:p>
+            <w:r>
+              <w:t>Ambiguidade</w:t>
+            </w:r>
+          </w:p>
+        </w:tc>
+        <w:tc>
+          <w:tcPr>
+            <w:tcW w:type="dxa" w:w="4986"/>
+          </w:tcPr>
+          <w:p>
+            <w:r>
+              <w:t>Quando um requisito admite mais de uma interpretação possível.</w:t>
+            </w:r>
+          </w:p>
+        </w:tc>
+      </w:tr>
+      <w:tr>
+        <w:tc>
+          <w:tcPr>
+            <w:tcW w:type="dxa" w:w="4986"/>
+          </w:tcPr>
+          <w:p>
+            <w:r>
+              <w:t>Conflito de requisitos</w:t>
+            </w:r>
+          </w:p>
+        </w:tc>
+        <w:tc>
+          <w:tcPr>
+            <w:tcW w:type="dxa" w:w="4986"/>
+          </w:tcPr>
+          <w:p>
+            <w:r>
+              <w:t>Quando dois requisitos, mesmo bem escritos, competem entre si e não podem ser plenamente satisfeitos ao mesmo tempo.</w:t>
+            </w:r>
+          </w:p>
+        </w:tc>
+      </w:tr>
+      <w:tr>
+        <w:tc>
+          <w:tcPr>
+            <w:tcW w:type="dxa" w:w="4986"/>
+          </w:tcPr>
+          <w:p>
+            <w:r>
+              <w:t>MoSCoW</w:t>
+            </w:r>
+          </w:p>
+        </w:tc>
+        <w:tc>
+          <w:tcPr>
+            <w:tcW w:type="dxa" w:w="4986"/>
+          </w:tcPr>
+          <w:p>
+            <w:r>
+              <w:t>Técnica de priorização de requisitos em quatro categorias: Must have, Should have, Could have e Won't have.</w:t>
+            </w:r>
+          </w:p>
+        </w:tc>
+      </w:tr>
+      <w:tr>
+        <w:tc>
+          <w:tcPr>
+            <w:tcW w:type="dxa" w:w="4986"/>
+          </w:tcPr>
+          <w:p>
+            <w:r>
+              <w:t>Critério de aceite</w:t>
+            </w:r>
+          </w:p>
+        </w:tc>
+        <w:tc>
+          <w:tcPr>
+            <w:tcW w:type="dxa" w:w="4986"/>
+          </w:tcPr>
+          <w:p>
+            <w:r>
+              <w:t>Condição objetiva (formato Dado/Quando/Então) que define quando um requisito pode ser considerado pronto e correto.</w:t>
+            </w:r>
+          </w:p>
+        </w:tc>
+      </w:tr>
     </w:tbl>
     <w:p/>
     <w:p>
@@ -2179,6 +3117,38 @@
       </w:pPr>
       <w:r>
         <w:t>9. Reescreva o RF ruim “O sistema deve gerenciar bem os pedidos” seguindo os critérios da seção 2.1.</w:t>
+      </w:r>
+    </w:p>
+    <w:p>
+      <w:pPr>
+        <w:pStyle w:val="ListNumber"/>
+      </w:pPr>
+      <w:r>
+        <w:t>10. O que torna um requisito ambíguo? Dê um exemplo (pode ser um dos que você mesmo escreveu na atividade) e reescreva-o de forma mais clara.</w:t>
+      </w:r>
+    </w:p>
+    <w:p>
+      <w:pPr>
+        <w:pStyle w:val="ListNumber"/>
+      </w:pPr>
+      <w:r>
+        <w:t>11. Explique a diferença entre um requisito “Must have” e um “Could have” no método MoSCoW, usando um exemplo do cenário TechBurger.</w:t>
+      </w:r>
+    </w:p>
+    <w:p>
+      <w:pPr>
+        <w:pStyle w:val="ListNumber"/>
+      </w:pPr>
+      <w:r>
+        <w:t>12. Escreva o critério de aceite (Dado/Quando/Então) para o RF “o sistema deve exigir confirmação manual de um gerente para pedidos com mais de 10 itens”.</w:t>
+      </w:r>
+    </w:p>
+    <w:p>
+      <w:pPr>
+        <w:pStyle w:val="ListNumber"/>
+      </w:pPr>
+      <w:r>
+        <w:t>13. Um grupo escreveu o RNF “O sistema deve ser seguro.” Explique por que esse RNF está ambíguo e reescreva-o classificando também sua categoria MoSCoW.</w:t>
       </w:r>
     </w:p>
     <w:sectPr>

</xml_diff>

<commit_message>
Enriquece Aula 2: quiz relampago, sintese do ciclo e corrige objetivos
Corrige objetivos desatualizados na apostila e no roteiro (faltavam
ambiguidade/conflitos, MoSCoW e as tecnicas de analise de documentos/
workshop). Adiciona quiz relampago RF x RNF antes do bloco de RNF e um
slide/secao de sintese fechando o ciclo regra->requisito->criterio de
aceite->UML.
</commit_message>
<xml_diff>
--- a/Aula 02 - 04-09-2026/Aula 2 - Apostila do Aluno.docx
+++ b/Aula 02 - 04-09-2026/Aula 2 - Apostila do Aluno.docx
@@ -68,6 +68,22 @@
       </w:pPr>
       <w:r>
         <w:t>Transformar regras de negócio em requisitos funcionais e propor requisitos não funcionais.</w:t>
+      </w:r>
+    </w:p>
+    <w:p>
+      <w:pPr>
+        <w:pStyle w:val="ListBullet"/>
+      </w:pPr>
+      <w:r>
+        <w:t>Reconhecer requisitos ambíguos ou conflitantes e propor correções.</w:t>
+      </w:r>
+    </w:p>
+    <w:p>
+      <w:pPr>
+        <w:pStyle w:val="ListBullet"/>
+      </w:pPr>
+      <w:r>
+        <w:t>Aplicar a técnica MoSCoW para priorizar requisitos.</w:t>
       </w:r>
     </w:p>
     <w:p>
@@ -567,6 +583,53 @@
         </w:tc>
       </w:tr>
     </w:tbl>
+    <w:p>
+      <w:pPr/>
+    </w:p>
+    <w:p>
+      <w:pPr>
+        <w:pStyle w:val="Heading2"/>
+      </w:pPr>
+      <w:r>
+        <w:t>2.2 Quiz relâmpago: RF ou RNF?</w:t>
+      </w:r>
+    </w:p>
+    <w:p>
+      <w:pPr/>
+      <w:r>
+        <w:t>Antes de seguir para Requisito Não-Funcional, testem o que já aprenderam. Para cada frase, respondam: RF ou RNF? (respostas no Gabarito)</w:t>
+      </w:r>
+    </w:p>
+    <w:p>
+      <w:pPr/>
+      <w:r>
+        <w:t>1. “O sistema deve permitir que o cliente cancele um pedido em até 5 minutos após a confirmação.”</w:t>
+      </w:r>
+    </w:p>
+    <w:p>
+      <w:pPr/>
+      <w:r>
+        <w:t>2. “O cancelamento deve ser processado em até 1 segundo.”</w:t>
+      </w:r>
+    </w:p>
+    <w:p>
+      <w:pPr/>
+      <w:r>
+        <w:t>3. “O sistema deve gerar um relatório mensal de vendas.”</w:t>
+      </w:r>
+    </w:p>
+    <w:p>
+      <w:pPr/>
+      <w:r>
+        <w:t>4. “O relatório mensal deve poder ser exportado em PDF ou Excel.”</w:t>
+      </w:r>
+    </w:p>
+    <w:p>
+      <w:pPr/>
+      <w:r>
+        <w:t>5. “O sistema deve funcionar corretamente mesmo com 500 pedidos simultâneos.”</w:t>
+      </w:r>
+    </w:p>
     <w:p>
       <w:pPr/>
     </w:p>
@@ -2467,6 +2530,35 @@
     </w:p>
     <w:p>
       <w:pPr>
+        <w:pStyle w:val="Heading2"/>
+      </w:pPr>
+      <w:r>
+        <w:t>7.4 Síntese: fechando o ciclo</w:t>
+      </w:r>
+    </w:p>
+    <w:p>
+      <w:pPr/>
+      <w:r>
+        <w:t>Tudo que fizemos hoje encaixa numa única cadeia, do negócio até o código:</w:t>
+      </w:r>
+    </w:p>
+    <w:p>
+      <w:pPr/>
+      <w:r>
+        <w:t>Regra de negócio  →  Requisito (RF ou RNF)  →  checar Ambiguidade/Conflito  →  Priorizar (MoSCoW)  →  Critério de Aceite  →  (Aula 3: representar tudo em UML)</w:t>
+      </w:r>
+    </w:p>
+    <w:p>
+      <w:pPr/>
+      <w:r>
+        <w:t>Cada seta é uma pergunta que vocês já sabem responder: o que o negócio precisa? isso vira o quê no sistema? está claro e sem conflito? entra na primeira versão? como sei que ficou pronto?</w:t>
+      </w:r>
+    </w:p>
+    <w:p>
+      <w:pPr/>
+    </w:p>
+    <w:p>
+      <w:pPr>
         <w:pStyle w:val="Heading1"/>
       </w:pPr>
       <w:r>
@@ -2687,6 +2779,69 @@
         </w:tc>
       </w:tr>
     </w:tbl>
+    <w:p>
+      <w:pPr/>
+    </w:p>
+    <w:p>
+      <w:pPr>
+        <w:pStyle w:val="Heading1"/>
+      </w:pPr>
+      <w:r>
+        <w:t>10. Erros comuns em entrevista de requisitos (se sobrar tempo)</w:t>
+      </w:r>
+    </w:p>
+    <w:p>
+      <w:pPr/>
+      <w:r>
+        <w:t>Voltando ao role-play do Bloco 7: aqui estão os erros mais comuns de quem está aprendendo a levantar requisitos por entrevista.</w:t>
+      </w:r>
+    </w:p>
+    <w:p>
+      <w:pPr>
+        <w:pStyle w:val="ListBullet"/>
+      </w:pPr>
+      <w:r>
+        <w:t>Perguntas fechadas demais (sim/não) em vez de abertas — perde detalhes importantes que o entrevistado nem lembraria de contar.</w:t>
+      </w:r>
+    </w:p>
+    <w:p>
+      <w:pPr>
+        <w:pStyle w:val="ListBullet"/>
+      </w:pPr>
+      <w:r>
+        <w:t>Induzir a resposta (“você não acha que seria melhor...?”) em vez de deixar o stakeholder responder livremente.</w:t>
+      </w:r>
+    </w:p>
+    <w:p>
+      <w:pPr>
+        <w:pStyle w:val="ListBullet"/>
+      </w:pPr>
+      <w:r>
+        <w:t>Não validar o que ouviu — não repetir/resumir de volta para o entrevistado, para confirmar que o entendimento está correto.</w:t>
+      </w:r>
+    </w:p>
+    <w:p>
+      <w:pPr>
+        <w:pStyle w:val="ListBullet"/>
+      </w:pPr>
+      <w:r>
+        <w:t>Focar em “como” o sistema deve funcionar em vez de “o que” o negócio precisa — viés de solução prematura, antes de entender o problema.</w:t>
+      </w:r>
+    </w:p>
+    <w:p>
+      <w:pPr>
+        <w:pStyle w:val="ListBullet"/>
+      </w:pPr>
+      <w:r>
+        <w:t>Não registrar a conversa e confiar só na memória depois — detalhes se perdem entre a entrevista e a redação dos requisitos.</w:t>
+      </w:r>
+    </w:p>
+    <w:p>
+      <w:pPr/>
+      <w:r>
+        <w:t>Reflexão: vocês sentiram algum desses erros durante o role-play do Bloco 7? Qual, e o que fariam diferente?</w:t>
+      </w:r>
+    </w:p>
     <w:p>
       <w:pPr/>
     </w:p>

</xml_diff>

<commit_message>
Reorganiza Aula 2: quiz apos RNF, adiciona slides de Criterio de Aceite e move sintese/glossario pro final
- Quiz relampago RF/RNF movido para depois de RF e RNF completos, com slide de respostas novo
- Adiciona slide de definicao do MoSCoW antes das categorias
- Expande Criterio de Aceite em 4 slides (definicao, formato, exemplo, pratica)
- Corrige formatacao inconsistente dos slides de Ambiguidade/Conflitos
- Move Sintese e Glossario para o final, depois do material de reserva
- Esclarece a mecanica do role-play de entrevista no slide
</commit_message>
<xml_diff>
--- a/Aula 02 - 04-09-2026/Aula 2 - Apostila do Aluno.docx
+++ b/Aula 02 - 04-09-2026/Aula 2 - Apostila do Aluno.docx
@@ -588,53 +588,6 @@
     </w:p>
     <w:p>
       <w:pPr>
-        <w:pStyle w:val="Heading2"/>
-      </w:pPr>
-      <w:r>
-        <w:t>2.2 Quiz relâmpago: RF ou RNF?</w:t>
-      </w:r>
-    </w:p>
-    <w:p>
-      <w:pPr/>
-      <w:r>
-        <w:t>Antes de seguir para Requisito Não-Funcional, testem o que já aprenderam. Para cada frase, respondam: RF ou RNF? (respostas no Gabarito)</w:t>
-      </w:r>
-    </w:p>
-    <w:p>
-      <w:pPr/>
-      <w:r>
-        <w:t>1. “O sistema deve permitir que o cliente cancele um pedido em até 5 minutos após a confirmação.”</w:t>
-      </w:r>
-    </w:p>
-    <w:p>
-      <w:pPr/>
-      <w:r>
-        <w:t>2. “O cancelamento deve ser processado em até 1 segundo.”</w:t>
-      </w:r>
-    </w:p>
-    <w:p>
-      <w:pPr/>
-      <w:r>
-        <w:t>3. “O sistema deve gerar um relatório mensal de vendas.”</w:t>
-      </w:r>
-    </w:p>
-    <w:p>
-      <w:pPr/>
-      <w:r>
-        <w:t>4. “O relatório mensal deve poder ser exportado em PDF ou Excel.”</w:t>
-      </w:r>
-    </w:p>
-    <w:p>
-      <w:pPr/>
-      <w:r>
-        <w:t>5. “O sistema deve funcionar corretamente mesmo com 500 pedidos simultâneos.”</w:t>
-      </w:r>
-    </w:p>
-    <w:p>
-      <w:pPr/>
-    </w:p>
-    <w:p>
-      <w:pPr>
         <w:pStyle w:val="Heading1"/>
       </w:pPr>
       <w:r>
@@ -1061,6 +1014,53 @@
         </w:tc>
       </w:tr>
     </w:tbl>
+    <w:p>
+      <w:pPr/>
+    </w:p>
+    <w:p>
+      <w:pPr>
+        <w:pStyle w:val="Heading2"/>
+      </w:pPr>
+      <w:r>
+        <w:t>3.2 Quiz relâmpago: RF ou RNF?</w:t>
+      </w:r>
+    </w:p>
+    <w:p>
+      <w:pPr/>
+      <w:r>
+        <w:t>Agora que vocês já viram Requisito Funcional e Requisito Não-Funcional, testem o que aprenderam. Para cada frase, respondam: RF ou RNF? (respostas no Gabarito)</w:t>
+      </w:r>
+    </w:p>
+    <w:p>
+      <w:pPr/>
+      <w:r>
+        <w:t>1. “O sistema deve permitir que o cliente cancele um pedido em até 5 minutos após a confirmação.”</w:t>
+      </w:r>
+    </w:p>
+    <w:p>
+      <w:pPr/>
+      <w:r>
+        <w:t>2. “O cancelamento deve ser processado em até 1 segundo.”</w:t>
+      </w:r>
+    </w:p>
+    <w:p>
+      <w:pPr/>
+      <w:r>
+        <w:t>3. “O sistema deve gerar um relatório mensal de vendas.”</w:t>
+      </w:r>
+    </w:p>
+    <w:p>
+      <w:pPr/>
+      <w:r>
+        <w:t>4. “O relatório mensal deve poder ser exportado em PDF ou Excel.”</w:t>
+      </w:r>
+    </w:p>
+    <w:p>
+      <w:pPr/>
+      <w:r>
+        <w:t>5. “O sistema deve funcionar corretamente mesmo com 500 pedidos simultâneos.”</w:t>
+      </w:r>
+    </w:p>
     <w:p>
       <w:pPr/>
     </w:p>
@@ -2530,35 +2530,6 @@
     </w:p>
     <w:p>
       <w:pPr>
-        <w:pStyle w:val="Heading2"/>
-      </w:pPr>
-      <w:r>
-        <w:t>7.4 Síntese: fechando o ciclo</w:t>
-      </w:r>
-    </w:p>
-    <w:p>
-      <w:pPr/>
-      <w:r>
-        <w:t>Tudo que fizemos hoje encaixa numa única cadeia, do negócio até o código:</w:t>
-      </w:r>
-    </w:p>
-    <w:p>
-      <w:pPr/>
-      <w:r>
-        <w:t>Regra de negócio  →  Requisito (RF ou RNF)  →  checar Ambiguidade/Conflito  →  Priorizar (MoSCoW)  →  Critério de Aceite  →  (Aula 3: representar tudo em UML)</w:t>
-      </w:r>
-    </w:p>
-    <w:p>
-      <w:pPr/>
-      <w:r>
-        <w:t>Cada seta é uma pergunta que vocês já sabem responder: o que o negócio precisa? isso vira o quê no sistema? está claro e sem conflito? entra na primeira versão? como sei que ficou pronto?</w:t>
-      </w:r>
-    </w:p>
-    <w:p>
-      <w:pPr/>
-    </w:p>
-    <w:p>
-      <w:pPr>
         <w:pStyle w:val="Heading1"/>
       </w:pPr>
       <w:r>
@@ -2840,6 +2811,35 @@
       <w:pPr/>
       <w:r>
         <w:t>Reflexão: vocês sentiram algum desses erros durante o role-play do Bloco 7? Qual, e o que fariam diferente?</w:t>
+      </w:r>
+    </w:p>
+    <w:p>
+      <w:pPr/>
+    </w:p>
+    <w:p>
+      <w:pPr>
+        <w:pStyle w:val="Heading1"/>
+      </w:pPr>
+      <w:r>
+        <w:t>11. Síntese: fechando o ciclo</w:t>
+      </w:r>
+    </w:p>
+    <w:p>
+      <w:pPr/>
+      <w:r>
+        <w:t>Tudo que fizemos hoje encaixa numa única cadeia, do negócio até o código:</w:t>
+      </w:r>
+    </w:p>
+    <w:p>
+      <w:pPr/>
+      <w:r>
+        <w:t>Regra de negócio  →  Requisito (RF ou RNF)  →  checar Ambiguidade/Conflito  →  Priorizar (MoSCoW)  →  Critério de Aceite  →  (Aula 3: representar tudo em UML)</w:t>
+      </w:r>
+    </w:p>
+    <w:p>
+      <w:pPr/>
+      <w:r>
+        <w:t>Cada seta é uma pergunta que vocês já sabem responder: o que o negócio precisa? isso vira o quê no sistema? está claro e sem conflito? entra na primeira versão? como sei que ficou pronto?</w:t>
       </w:r>
     </w:p>
     <w:p>

</xml_diff>